<commit_message>
Add pre-defense protocol (RU/KZ) and extended meeting materials
- Pre-defense protocol drafts in RU and KZ + GOST-formatted docx/pdf
- Extended department meeting (2026-08-26) transcript, attendees, chat
- Council doc 22: attendees overlap, samples, updated brief/structure/QA
- Short KZ official reviewer review; reviewer 2 review regenerated
- council-docs skill script updates

Co-Authored-By: Claude Opus 5 <noreply@anthropic.com>
Claude-Session: https://claude.ai/code/session_01BmnM6bWhxfLjyEZuTvkudw
</commit_message>
<xml_diff>
--- a/defense/docs/reviews/official_reviewer_2_review_kz.docx
+++ b/defense/docs/reviews/official_reviewer_2_review_kz.docx
@@ -40,15 +40,14 @@
         <w:tblStyle w:val="TableGrid"/>
         <w:tblW w:type="auto" w:w="0"/>
         <w:jc w:val="center"/>
-        <w:tblLayout w:type="fixed"/>
         <w:tblLook w:firstColumn="1" w:firstRow="1" w:lastColumn="0" w:lastRow="0" w:noHBand="0" w:noVBand="1" w:val="04A0"/>
         <w:tblLayout w:type="fixed"/>
       </w:tblPr>
       <w:tblGrid>
-        <w:gridCol w:w="3642"/>
-        <w:gridCol w:w="3642"/>
-        <w:gridCol w:w="3642"/>
-        <w:gridCol w:w="3642"/>
+        <w:gridCol w:w="729"/>
+        <w:gridCol w:w="2477"/>
+        <w:gridCol w:w="3497"/>
+        <w:gridCol w:w="7868"/>
       </w:tblGrid>
       <w:tr>
         <w:trPr>
@@ -57,7 +56,7 @@
         </w:trPr>
         <w:tc>
           <w:tcPr>
-            <w:tcW w:type="dxa" w:w="583"/>
+            <w:tcW w:type="dxa" w:w="729"/>
           </w:tcPr>
           <w:p>
             <w:pPr>
@@ -101,7 +100,7 @@
         </w:tc>
         <w:tc>
           <w:tcPr>
-            <w:tcW w:type="dxa" w:w="3643"/>
+            <w:tcW w:type="dxa" w:w="3497"/>
           </w:tcPr>
           <w:p>
             <w:pPr>
@@ -145,12 +144,9 @@
         </w:tc>
       </w:tr>
       <w:tr>
-        <w:trPr>
-          <w:cantSplit/>
-        </w:trPr>
         <w:tc>
           <w:tcPr>
-            <w:tcW w:type="dxa" w:w="583"/>
+            <w:tcW w:type="dxa" w:w="729"/>
           </w:tcPr>
           <w:p>
             <w:pPr>
@@ -194,7 +190,7 @@
         </w:tc>
         <w:tc>
           <w:tcPr>
-            <w:tcW w:type="dxa" w:w="3643"/>
+            <w:tcW w:type="dxa" w:w="3497"/>
           </w:tcPr>
           <w:p>
             <w:pPr>
@@ -366,12 +362,9 @@
         </w:tc>
       </w:tr>
       <w:tr>
-        <w:trPr>
-          <w:cantSplit/>
-        </w:trPr>
         <w:tc>
           <w:tcPr>
-            <w:tcW w:type="dxa" w:w="583"/>
+            <w:tcW w:type="dxa" w:w="729"/>
           </w:tcPr>
           <w:p>
             <w:pPr>
@@ -415,7 +408,7 @@
         </w:tc>
         <w:tc>
           <w:tcPr>
-            <w:tcW w:type="dxa" w:w="3643"/>
+            <w:tcW w:type="dxa" w:w="3497"/>
           </w:tcPr>
           <w:p>
             <w:pPr>
@@ -515,12 +508,9 @@
         </w:tc>
       </w:tr>
       <w:tr>
-        <w:trPr>
-          <w:cantSplit/>
-        </w:trPr>
         <w:tc>
           <w:tcPr>
-            <w:tcW w:type="dxa" w:w="583"/>
+            <w:tcW w:type="dxa" w:w="729"/>
           </w:tcPr>
           <w:p>
             <w:pPr>
@@ -564,7 +554,7 @@
         </w:tc>
         <w:tc>
           <w:tcPr>
-            <w:tcW w:type="dxa" w:w="3643"/>
+            <w:tcW w:type="dxa" w:w="3497"/>
           </w:tcPr>
           <w:p>
             <w:pPr>
@@ -698,12 +688,9 @@
         </w:tc>
       </w:tr>
       <w:tr>
-        <w:trPr>
-          <w:cantSplit/>
-        </w:trPr>
         <w:tc>
           <w:tcPr>
-            <w:tcW w:type="dxa" w:w="583"/>
+            <w:tcW w:type="dxa" w:w="729"/>
             <w:vMerge w:val="restart"/>
           </w:tcPr>
           <w:p>
@@ -805,7 +792,7 @@
         </w:tc>
         <w:tc>
           <w:tcPr>
-            <w:tcW w:type="dxa" w:w="3643"/>
+            <w:tcW w:type="dxa" w:w="3497"/>
           </w:tcPr>
           <w:p>
             <w:pPr>
@@ -907,12 +894,9 @@
         </w:tc>
       </w:tr>
       <w:tr>
-        <w:trPr>
-          <w:cantSplit/>
-        </w:trPr>
         <w:tc>
           <w:tcPr>
-            <w:tcW w:type="dxa" w:w="583"/>
+            <w:tcW w:type="dxa" w:w="729"/>
             <w:vMerge/>
           </w:tcPr>
           <w:p/>
@@ -926,7 +910,7 @@
         </w:tc>
         <w:tc>
           <w:tcPr>
-            <w:tcW w:type="dxa" w:w="3643"/>
+            <w:tcW w:type="dxa" w:w="3497"/>
           </w:tcPr>
           <w:p>
             <w:pPr>
@@ -1028,12 +1012,9 @@
         </w:tc>
       </w:tr>
       <w:tr>
-        <w:trPr>
-          <w:cantSplit/>
-        </w:trPr>
         <w:tc>
           <w:tcPr>
-            <w:tcW w:type="dxa" w:w="583"/>
+            <w:tcW w:type="dxa" w:w="729"/>
             <w:vMerge/>
           </w:tcPr>
           <w:p/>
@@ -1047,7 +1028,7 @@
         </w:tc>
         <w:tc>
           <w:tcPr>
-            <w:tcW w:type="dxa" w:w="3643"/>
+            <w:tcW w:type="dxa" w:w="3497"/>
           </w:tcPr>
           <w:p>
             <w:pPr>
@@ -1149,12 +1130,9 @@
         </w:tc>
       </w:tr>
       <w:tr>
-        <w:trPr>
-          <w:cantSplit/>
-        </w:trPr>
         <w:tc>
           <w:tcPr>
-            <w:tcW w:type="dxa" w:w="583"/>
+            <w:tcW w:type="dxa" w:w="729"/>
             <w:vMerge/>
           </w:tcPr>
           <w:p/>
@@ -1168,7 +1146,7 @@
         </w:tc>
         <w:tc>
           <w:tcPr>
-            <w:tcW w:type="dxa" w:w="3643"/>
+            <w:tcW w:type="dxa" w:w="3497"/>
           </w:tcPr>
           <w:p>
             <w:pPr>
@@ -1270,12 +1248,9 @@
         </w:tc>
       </w:tr>
       <w:tr>
-        <w:trPr>
-          <w:cantSplit/>
-        </w:trPr>
         <w:tc>
           <w:tcPr>
-            <w:tcW w:type="dxa" w:w="583"/>
+            <w:tcW w:type="dxa" w:w="729"/>
             <w:vMerge/>
           </w:tcPr>
           <w:p/>
@@ -1289,7 +1264,7 @@
         </w:tc>
         <w:tc>
           <w:tcPr>
-            <w:tcW w:type="dxa" w:w="3643"/>
+            <w:tcW w:type="dxa" w:w="3497"/>
           </w:tcPr>
           <w:p>
             <w:pPr>
@@ -1391,12 +1366,9 @@
         </w:tc>
       </w:tr>
       <w:tr>
-        <w:trPr>
-          <w:cantSplit/>
-        </w:trPr>
         <w:tc>
           <w:tcPr>
-            <w:tcW w:type="dxa" w:w="583"/>
+            <w:tcW w:type="dxa" w:w="729"/>
             <w:vMerge w:val="restart"/>
           </w:tcPr>
           <w:p>
@@ -1470,7 +1442,7 @@
         </w:tc>
         <w:tc>
           <w:tcPr>
-            <w:tcW w:type="dxa" w:w="3643"/>
+            <w:tcW w:type="dxa" w:w="3497"/>
           </w:tcPr>
           <w:p>
             <w:pPr>
@@ -1588,12 +1560,9 @@
         </w:tc>
       </w:tr>
       <w:tr>
-        <w:trPr>
-          <w:cantSplit/>
-        </w:trPr>
         <w:tc>
           <w:tcPr>
-            <w:tcW w:type="dxa" w:w="583"/>
+            <w:tcW w:type="dxa" w:w="729"/>
             <w:vMerge/>
           </w:tcPr>
           <w:p/>
@@ -1607,7 +1576,7 @@
         </w:tc>
         <w:tc>
           <w:tcPr>
-            <w:tcW w:type="dxa" w:w="3643"/>
+            <w:tcW w:type="dxa" w:w="3497"/>
           </w:tcPr>
           <w:p>
             <w:pPr>
@@ -1709,12 +1678,9 @@
         </w:tc>
       </w:tr>
       <w:tr>
-        <w:trPr>
-          <w:cantSplit/>
-        </w:trPr>
         <w:tc>
           <w:tcPr>
-            <w:tcW w:type="dxa" w:w="583"/>
+            <w:tcW w:type="dxa" w:w="729"/>
             <w:vMerge/>
           </w:tcPr>
           <w:p/>
@@ -1728,7 +1694,7 @@
         </w:tc>
         <w:tc>
           <w:tcPr>
-            <w:tcW w:type="dxa" w:w="3643"/>
+            <w:tcW w:type="dxa" w:w="3497"/>
           </w:tcPr>
           <w:p>
             <w:pPr>
@@ -1830,12 +1796,9 @@
         </w:tc>
       </w:tr>
       <w:tr>
-        <w:trPr>
-          <w:cantSplit/>
-        </w:trPr>
         <w:tc>
           <w:tcPr>
-            <w:tcW w:type="dxa" w:w="583"/>
+            <w:tcW w:type="dxa" w:w="729"/>
           </w:tcPr>
           <w:p>
             <w:pPr>
@@ -1879,7 +1842,7 @@
         </w:tc>
         <w:tc>
           <w:tcPr>
-            <w:tcW w:type="dxa" w:w="3643"/>
+            <w:tcW w:type="dxa" w:w="3497"/>
           </w:tcPr>
           <w:p>
             <w:pPr>
@@ -1959,12 +1922,9 @@
         </w:tc>
       </w:tr>
       <w:tr>
-        <w:trPr>
-          <w:cantSplit/>
-        </w:trPr>
         <w:tc>
           <w:tcPr>
-            <w:tcW w:type="dxa" w:w="583"/>
+            <w:tcW w:type="dxa" w:w="729"/>
             <w:vMerge w:val="restart"/>
           </w:tcPr>
           <w:p>
@@ -2150,7 +2110,7 @@
         </w:tc>
         <w:tc>
           <w:tcPr>
-            <w:tcW w:type="dxa" w:w="3643"/>
+            <w:tcW w:type="dxa" w:w="3497"/>
             <w:vMerge w:val="restart"/>
           </w:tcPr>
           <w:p>
@@ -2403,12 +2363,9 @@
         </w:tc>
       </w:tr>
       <w:tr>
-        <w:trPr>
-          <w:cantSplit/>
-        </w:trPr>
         <w:tc>
           <w:tcPr>
-            <w:tcW w:type="dxa" w:w="583"/>
+            <w:tcW w:type="dxa" w:w="729"/>
             <w:vMerge/>
           </w:tcPr>
           <w:p/>
@@ -2422,7 +2379,7 @@
         </w:tc>
         <w:tc>
           <w:tcPr>
-            <w:tcW w:type="dxa" w:w="3643"/>
+            <w:tcW w:type="dxa" w:w="3497"/>
             <w:vMerge/>
           </w:tcPr>
           <w:p/>
@@ -2493,12 +2450,9 @@
         </w:tc>
       </w:tr>
       <w:tr>
-        <w:trPr>
-          <w:cantSplit/>
-        </w:trPr>
         <w:tc>
           <w:tcPr>
-            <w:tcW w:type="dxa" w:w="583"/>
+            <w:tcW w:type="dxa" w:w="729"/>
             <w:vMerge/>
           </w:tcPr>
           <w:p/>
@@ -2512,7 +2466,7 @@
         </w:tc>
         <w:tc>
           <w:tcPr>
-            <w:tcW w:type="dxa" w:w="3643"/>
+            <w:tcW w:type="dxa" w:w="3497"/>
             <w:vMerge/>
           </w:tcPr>
           <w:p/>
@@ -2583,12 +2537,9 @@
         </w:tc>
       </w:tr>
       <w:tr>
-        <w:trPr>
-          <w:cantSplit/>
-        </w:trPr>
         <w:tc>
           <w:tcPr>
-            <w:tcW w:type="dxa" w:w="583"/>
+            <w:tcW w:type="dxa" w:w="729"/>
             <w:vMerge/>
           </w:tcPr>
           <w:p/>
@@ -2602,7 +2553,7 @@
         </w:tc>
         <w:tc>
           <w:tcPr>
-            <w:tcW w:type="dxa" w:w="3643"/>
+            <w:tcW w:type="dxa" w:w="3497"/>
             <w:vMerge/>
           </w:tcPr>
           <w:p/>
@@ -2673,12 +2624,9 @@
         </w:tc>
       </w:tr>
       <w:tr>
-        <w:trPr>
-          <w:cantSplit/>
-        </w:trPr>
         <w:tc>
           <w:tcPr>
-            <w:tcW w:type="dxa" w:w="583"/>
+            <w:tcW w:type="dxa" w:w="729"/>
             <w:vMerge/>
           </w:tcPr>
           <w:p/>
@@ -2692,7 +2640,7 @@
         </w:tc>
         <w:tc>
           <w:tcPr>
-            <w:tcW w:type="dxa" w:w="3643"/>
+            <w:tcW w:type="dxa" w:w="3497"/>
             <w:vMerge/>
           </w:tcPr>
           <w:p/>
@@ -2763,12 +2711,9 @@
         </w:tc>
       </w:tr>
       <w:tr>
-        <w:trPr>
-          <w:cantSplit/>
-        </w:trPr>
         <w:tc>
           <w:tcPr>
-            <w:tcW w:type="dxa" w:w="583"/>
+            <w:tcW w:type="dxa" w:w="729"/>
             <w:vMerge/>
           </w:tcPr>
           <w:p/>
@@ -2782,7 +2727,7 @@
         </w:tc>
         <w:tc>
           <w:tcPr>
-            <w:tcW w:type="dxa" w:w="3643"/>
+            <w:tcW w:type="dxa" w:w="3497"/>
             <w:vMerge/>
           </w:tcPr>
           <w:p/>
@@ -2853,12 +2798,9 @@
         </w:tc>
       </w:tr>
       <w:tr>
-        <w:trPr>
-          <w:cantSplit/>
-        </w:trPr>
         <w:tc>
           <w:tcPr>
-            <w:tcW w:type="dxa" w:w="583"/>
+            <w:tcW w:type="dxa" w:w="729"/>
             <w:vMerge/>
           </w:tcPr>
           <w:p/>
@@ -2872,7 +2814,7 @@
         </w:tc>
         <w:tc>
           <w:tcPr>
-            <w:tcW w:type="dxa" w:w="3643"/>
+            <w:tcW w:type="dxa" w:w="3497"/>
             <w:vMerge/>
           </w:tcPr>
           <w:p/>
@@ -2943,12 +2885,9 @@
         </w:tc>
       </w:tr>
       <w:tr>
-        <w:trPr>
-          <w:cantSplit/>
-        </w:trPr>
         <w:tc>
           <w:tcPr>
-            <w:tcW w:type="dxa" w:w="583"/>
+            <w:tcW w:type="dxa" w:w="729"/>
             <w:vMerge/>
           </w:tcPr>
           <w:p/>
@@ -2962,7 +2901,7 @@
         </w:tc>
         <w:tc>
           <w:tcPr>
-            <w:tcW w:type="dxa" w:w="3643"/>
+            <w:tcW w:type="dxa" w:w="3497"/>
             <w:vMerge/>
           </w:tcPr>
           <w:p/>
@@ -3033,12 +2972,9 @@
         </w:tc>
       </w:tr>
       <w:tr>
-        <w:trPr>
-          <w:cantSplit/>
-        </w:trPr>
         <w:tc>
           <w:tcPr>
-            <w:tcW w:type="dxa" w:w="583"/>
+            <w:tcW w:type="dxa" w:w="729"/>
             <w:vMerge/>
           </w:tcPr>
           <w:p/>
@@ -3052,7 +2988,7 @@
         </w:tc>
         <w:tc>
           <w:tcPr>
-            <w:tcW w:type="dxa" w:w="3643"/>
+            <w:tcW w:type="dxa" w:w="3497"/>
             <w:vMerge/>
           </w:tcPr>
           <w:p/>
@@ -3123,12 +3059,9 @@
         </w:tc>
       </w:tr>
       <w:tr>
-        <w:trPr>
-          <w:cantSplit/>
-        </w:trPr>
         <w:tc>
           <w:tcPr>
-            <w:tcW w:type="dxa" w:w="583"/>
+            <w:tcW w:type="dxa" w:w="729"/>
             <w:vMerge/>
           </w:tcPr>
           <w:p/>
@@ -3142,7 +3075,7 @@
         </w:tc>
         <w:tc>
           <w:tcPr>
-            <w:tcW w:type="dxa" w:w="3643"/>
+            <w:tcW w:type="dxa" w:w="3497"/>
             <w:vMerge/>
           </w:tcPr>
           <w:p/>
@@ -3213,12 +3146,9 @@
         </w:tc>
       </w:tr>
       <w:tr>
-        <w:trPr>
-          <w:cantSplit/>
-        </w:trPr>
         <w:tc>
           <w:tcPr>
-            <w:tcW w:type="dxa" w:w="583"/>
+            <w:tcW w:type="dxa" w:w="729"/>
             <w:vMerge/>
           </w:tcPr>
           <w:p/>
@@ -3232,7 +3162,7 @@
         </w:tc>
         <w:tc>
           <w:tcPr>
-            <w:tcW w:type="dxa" w:w="3643"/>
+            <w:tcW w:type="dxa" w:w="3497"/>
             <w:vMerge/>
           </w:tcPr>
           <w:p/>
@@ -3319,12 +3249,9 @@
         </w:tc>
       </w:tr>
       <w:tr>
-        <w:trPr>
-          <w:cantSplit/>
-        </w:trPr>
         <w:tc>
           <w:tcPr>
-            <w:tcW w:type="dxa" w:w="583"/>
+            <w:tcW w:type="dxa" w:w="729"/>
             <w:vMerge w:val="restart"/>
           </w:tcPr>
           <w:p>
@@ -3426,7 +3353,7 @@
         </w:tc>
         <w:tc>
           <w:tcPr>
-            <w:tcW w:type="dxa" w:w="3643"/>
+            <w:tcW w:type="dxa" w:w="3497"/>
           </w:tcPr>
           <w:p>
             <w:pPr>
@@ -3512,12 +3439,9 @@
         </w:tc>
       </w:tr>
       <w:tr>
-        <w:trPr>
-          <w:cantSplit/>
-        </w:trPr>
         <w:tc>
           <w:tcPr>
-            <w:tcW w:type="dxa" w:w="583"/>
+            <w:tcW w:type="dxa" w:w="729"/>
             <w:vMerge/>
           </w:tcPr>
           <w:p/>
@@ -3531,7 +3455,7 @@
         </w:tc>
         <w:tc>
           <w:tcPr>
-            <w:tcW w:type="dxa" w:w="3643"/>
+            <w:tcW w:type="dxa" w:w="3497"/>
           </w:tcPr>
           <w:p>
             <w:pPr>
@@ -3617,12 +3541,9 @@
         </w:tc>
       </w:tr>
       <w:tr>
-        <w:trPr>
-          <w:cantSplit/>
-        </w:trPr>
         <w:tc>
           <w:tcPr>
-            <w:tcW w:type="dxa" w:w="583"/>
+            <w:tcW w:type="dxa" w:w="729"/>
             <w:vMerge/>
           </w:tcPr>
           <w:p/>
@@ -3636,7 +3557,7 @@
         </w:tc>
         <w:tc>
           <w:tcPr>
-            <w:tcW w:type="dxa" w:w="3643"/>
+            <w:tcW w:type="dxa" w:w="3497"/>
           </w:tcPr>
           <w:p>
             <w:pPr>
@@ -3722,12 +3643,9 @@
         </w:tc>
       </w:tr>
       <w:tr>
-        <w:trPr>
-          <w:cantSplit/>
-        </w:trPr>
         <w:tc>
           <w:tcPr>
-            <w:tcW w:type="dxa" w:w="583"/>
+            <w:tcW w:type="dxa" w:w="729"/>
             <w:vMerge/>
           </w:tcPr>
           <w:p/>
@@ -3741,7 +3659,7 @@
         </w:tc>
         <w:tc>
           <w:tcPr>
-            <w:tcW w:type="dxa" w:w="3643"/>
+            <w:tcW w:type="dxa" w:w="3497"/>
           </w:tcPr>
           <w:p>
             <w:pPr>
@@ -3805,12 +3723,9 @@
         </w:tc>
       </w:tr>
       <w:tr>
-        <w:trPr>
-          <w:cantSplit/>
-        </w:trPr>
         <w:tc>
           <w:tcPr>
-            <w:tcW w:type="dxa" w:w="583"/>
+            <w:tcW w:type="dxa" w:w="729"/>
             <w:vMerge/>
           </w:tcPr>
           <w:p/>
@@ -3824,7 +3739,7 @@
         </w:tc>
         <w:tc>
           <w:tcPr>
-            <w:tcW w:type="dxa" w:w="3643"/>
+            <w:tcW w:type="dxa" w:w="3497"/>
           </w:tcPr>
           <w:p>
             <w:pPr>
@@ -3904,12 +3819,9 @@
         </w:tc>
       </w:tr>
       <w:tr>
-        <w:trPr>
-          <w:cantSplit/>
-        </w:trPr>
         <w:tc>
           <w:tcPr>
-            <w:tcW w:type="dxa" w:w="583"/>
+            <w:tcW w:type="dxa" w:w="729"/>
             <w:vMerge w:val="restart"/>
           </w:tcPr>
           <w:p>
@@ -3983,7 +3895,7 @@
         </w:tc>
         <w:tc>
           <w:tcPr>
-            <w:tcW w:type="dxa" w:w="3643"/>
+            <w:tcW w:type="dxa" w:w="3497"/>
           </w:tcPr>
           <w:p>
             <w:pPr>
@@ -4069,12 +3981,9 @@
         </w:tc>
       </w:tr>
       <w:tr>
-        <w:trPr>
-          <w:cantSplit/>
-        </w:trPr>
         <w:tc>
           <w:tcPr>
-            <w:tcW w:type="dxa" w:w="583"/>
+            <w:tcW w:type="dxa" w:w="729"/>
             <w:vMerge/>
           </w:tcPr>
           <w:p/>
@@ -4088,7 +3997,7 @@
         </w:tc>
         <w:tc>
           <w:tcPr>
-            <w:tcW w:type="dxa" w:w="3643"/>
+            <w:tcW w:type="dxa" w:w="3497"/>
           </w:tcPr>
           <w:p>
             <w:pPr>
@@ -4174,12 +4083,9 @@
         </w:tc>
       </w:tr>
       <w:tr>
-        <w:trPr>
-          <w:cantSplit/>
-        </w:trPr>
         <w:tc>
           <w:tcPr>
-            <w:tcW w:type="dxa" w:w="583"/>
+            <w:tcW w:type="dxa" w:w="729"/>
             <w:vMerge/>
           </w:tcPr>
           <w:p/>
@@ -4193,7 +4099,7 @@
         </w:tc>
         <w:tc>
           <w:tcPr>
-            <w:tcW w:type="dxa" w:w="3643"/>
+            <w:tcW w:type="dxa" w:w="3497"/>
           </w:tcPr>
           <w:p>
             <w:pPr>
@@ -4295,12 +4201,9 @@
         </w:tc>
       </w:tr>
       <w:tr>
-        <w:trPr>
-          <w:cantSplit/>
-        </w:trPr>
         <w:tc>
           <w:tcPr>
-            <w:tcW w:type="dxa" w:w="583"/>
+            <w:tcW w:type="dxa" w:w="729"/>
           </w:tcPr>
           <w:p>
             <w:pPr>
@@ -4344,7 +4247,7 @@
         </w:tc>
         <w:tc>
           <w:tcPr>
-            <w:tcW w:type="dxa" w:w="3643"/>
+            <w:tcW w:type="dxa" w:w="3497"/>
           </w:tcPr>
           <w:p>
             <w:pPr>
@@ -4478,12 +4381,9 @@
         </w:tc>
       </w:tr>
       <w:tr>
-        <w:trPr>
-          <w:cantSplit/>
-        </w:trPr>
         <w:tc>
           <w:tcPr>
-            <w:tcW w:type="dxa" w:w="583"/>
+            <w:tcW w:type="dxa" w:w="729"/>
           </w:tcPr>
           <w:p>
             <w:pPr>
@@ -4527,7 +4427,7 @@
         </w:tc>
         <w:tc>
           <w:tcPr>
-            <w:tcW w:type="dxa" w:w="3643"/>
+            <w:tcW w:type="dxa" w:w="3497"/>
           </w:tcPr>
           <w:p>
             <w:pPr>
@@ -4609,12 +4509,9 @@
         </w:tc>
       </w:tr>
       <w:tr>
-        <w:trPr>
-          <w:cantSplit/>
-        </w:trPr>
         <w:tc>
           <w:tcPr>
-            <w:tcW w:type="dxa" w:w="583"/>
+            <w:tcW w:type="dxa" w:w="729"/>
           </w:tcPr>
           <w:p>
             <w:pPr>
@@ -4658,7 +4555,7 @@
         </w:tc>
         <w:tc>
           <w:tcPr>
-            <w:tcW w:type="dxa" w:w="3643"/>
+            <w:tcW w:type="dxa" w:w="3497"/>
           </w:tcPr>
           <w:p>
             <w:pPr>
@@ -4856,12 +4753,9 @@
         </w:tc>
       </w:tr>
       <w:tr>
-        <w:trPr>
-          <w:cantSplit/>
-        </w:trPr>
         <w:tc>
           <w:tcPr>
-            <w:tcW w:type="dxa" w:w="583"/>
+            <w:tcW w:type="dxa" w:w="729"/>
           </w:tcPr>
           <w:p>
             <w:pPr>
@@ -4905,7 +4799,7 @@
         </w:tc>
         <w:tc>
           <w:tcPr>
-            <w:tcW w:type="dxa" w:w="3643"/>
+            <w:tcW w:type="dxa" w:w="3497"/>
           </w:tcPr>
           <w:p>
             <w:pPr>

</xml_diff>